<commit_message>
CIS 2026-27: match shortfall waiver by MATNR (YRVA_QAIS_TNTLFT confirmed)
YRVA_QAIS_TNTLFT stores the signed item as MATNR (CHAR 40), not a grade
code (confirmed from DDIC). Rework the auto shortfall-waiver (Clause 8 /
R2) to declare and match at material level:

- ZCIS_SHORTFALL_GRD key field GRADE -> MATNR (per customer approval).
- build_cis_shortfall now selects YRVA_QAIS_TNTLFT-QAIS_NO via FOR ALL
  ENTRIES on the declared-shortfall materials (removes the full-table
  scan and the unverified 'grade' field assumption).
- Drop the now-unused is_shortfall_grade helper and work area.
- Update DDIC objects doc, copy-to-system checklist and the customer
  approval document to reflect the MATNR-based shortfall table.

Co-Authored-By: Claude Opus 4.8 <noreply@anthropic.com>
Claude-Session: https://claude.ai/code/session_01A3BJ7ydDq6e8VDbD1uvXUk
</commit_message>
<xml_diff>
--- a/CIS_2026_27_Tables_for_Approval.docx
+++ b/CIS_2026_27_Tables_for_Approval.docx
@@ -555,7 +555,7 @@
                 <w:b w:val="0"/>
                 <w:sz w:val="19"/>
               </w:rPr>
-              <w:t>Grades declared as shortfall for a given period (process-owner maintained)</w:t>
+              <w:t>Materials declared as shortfall for a given period (process-owner maintained)</w:t>
             </w:r>
           </w:p>
         </w:tc>
@@ -2465,7 +2465,7 @@
           <w:color w:val="1F3864"/>
           <w:sz w:val="22"/>
         </w:rPr>
-        <w:t>3.3  ZCIS_SHORTFALL_GRD — Shortfall Grades (R2)</w:t>
+        <w:t>3.3  ZCIS_SHORTFALL_GRD — Shortfall Materials (R2)</w:t>
       </w:r>
     </w:p>
     <w:p>
@@ -2474,7 +2474,7 @@
           <w:i w:val="0"/>
           <w:sz w:val="21"/>
         </w:rPr>
-        <w:t>Grades declared as shortfall by the process owner for a given period. Used to auto-apply the monthly shortfall waiver.</w:t>
+        <w:t>Materials declared as shortfall by the process owner for a given period. Used to auto-apply the monthly shortfall waiver. The declared material is matched directly against the signed material (MATNR) in table YRVA_QAIS_TNTLFT.</w:t>
       </w:r>
     </w:p>
     <w:tbl>
@@ -2527,7 +2527,7 @@
         </w:tc>
         <w:tc>
           <w:tcPr>
-            <w:tcW w:type="dxa" w:w="3168"/>
+            <w:tcW w:type="dxa" w:w="2880"/>
             <w:shd w:val="clear" w:fill="1F3864"/>
           </w:tcPr>
           <w:p>
@@ -2544,7 +2544,7 @@
         </w:tc>
         <w:tc>
           <w:tcPr>
-            <w:tcW w:type="dxa" w:w="3312"/>
+            <w:tcW w:type="dxa" w:w="3600"/>
             <w:shd w:val="clear" w:fill="1F3864"/>
           </w:tcPr>
           <w:p>
@@ -2593,7 +2593,7 @@
         </w:tc>
         <w:tc>
           <w:tcPr>
-            <w:tcW w:type="dxa" w:w="3168"/>
+            <w:tcW w:type="dxa" w:w="2880"/>
           </w:tcPr>
           <w:p>
             <w:r/>
@@ -2608,7 +2608,7 @@
         </w:tc>
         <w:tc>
           <w:tcPr>
-            <w:tcW w:type="dxa" w:w="3312"/>
+            <w:tcW w:type="dxa" w:w="3600"/>
           </w:tcPr>
           <w:p>
             <w:r/>
@@ -2657,7 +2657,7 @@
         </w:tc>
         <w:tc>
           <w:tcPr>
-            <w:tcW w:type="dxa" w:w="3168"/>
+            <w:tcW w:type="dxa" w:w="2880"/>
             <w:shd w:val="clear" w:fill="F2F5FA"/>
           </w:tcPr>
           <w:p>
@@ -2673,7 +2673,7 @@
         </w:tc>
         <w:tc>
           <w:tcPr>
-            <w:tcW w:type="dxa" w:w="3312"/>
+            <w:tcW w:type="dxa" w:w="3600"/>
             <w:shd w:val="clear" w:fill="F2F5FA"/>
           </w:tcPr>
           <w:p>
@@ -2721,7 +2721,7 @@
         </w:tc>
         <w:tc>
           <w:tcPr>
-            <w:tcW w:type="dxa" w:w="3168"/>
+            <w:tcW w:type="dxa" w:w="2880"/>
           </w:tcPr>
           <w:p>
             <w:r/>
@@ -2736,7 +2736,7 @@
         </w:tc>
         <w:tc>
           <w:tcPr>
-            <w:tcW w:type="dxa" w:w="3312"/>
+            <w:tcW w:type="dxa" w:w="3600"/>
           </w:tcPr>
           <w:p>
             <w:r/>
@@ -2763,7 +2763,7 @@
                 <w:b w:val="0"/>
                 <w:sz w:val="19"/>
               </w:rPr>
-              <w:t>GRADE</w:t>
+              <w:t>MATNR</w:t>
             </w:r>
           </w:p>
         </w:tc>
@@ -2785,7 +2785,7 @@
         </w:tc>
         <w:tc>
           <w:tcPr>
-            <w:tcW w:type="dxa" w:w="3168"/>
+            <w:tcW w:type="dxa" w:w="2880"/>
             <w:shd w:val="clear" w:fill="F2F5FA"/>
           </w:tcPr>
           <w:p>
@@ -2795,13 +2795,13 @@
                 <w:b w:val="0"/>
                 <w:sz w:val="19"/>
               </w:rPr>
-              <w:t>as YRVA_PRS_GRADES grade</w:t>
+              <w:t>MATNR (CHAR 40)</w:t>
             </w:r>
           </w:p>
         </w:tc>
         <w:tc>
           <w:tcPr>
-            <w:tcW w:type="dxa" w:w="3312"/>
+            <w:tcW w:type="dxa" w:w="3600"/>
             <w:shd w:val="clear" w:fill="F2F5FA"/>
           </w:tcPr>
           <w:p>
@@ -2811,7 +2811,7 @@
                 <w:b w:val="0"/>
                 <w:sz w:val="19"/>
               </w:rPr>
-              <w:t>Grade declared shortfall</w:t>
+              <w:t>Material declared shortfall (matches YRVA_QAIS_TNTLFT-MATNR)</w:t>
             </w:r>
           </w:p>
         </w:tc>
@@ -2828,7 +2828,7 @@
                 <w:b w:val="0"/>
                 <w:sz w:val="19"/>
               </w:rPr>
-              <w:t>PRS_IND</w:t>
+              <w:t>CREATED_BY</w:t>
             </w:r>
           </w:p>
         </w:tc>
@@ -2849,7 +2849,7 @@
         </w:tc>
         <w:tc>
           <w:tcPr>
-            <w:tcW w:type="dxa" w:w="3168"/>
+            <w:tcW w:type="dxa" w:w="2880"/>
           </w:tcPr>
           <w:p>
             <w:r/>
@@ -2858,13 +2858,13 @@
                 <w:b w:val="0"/>
                 <w:sz w:val="19"/>
               </w:rPr>
-              <w:t>CHAR 1</w:t>
+              <w:t>UNAME (CHAR 12)</w:t>
             </w:r>
           </w:p>
         </w:tc>
         <w:tc>
           <w:tcPr>
-            <w:tcW w:type="dxa" w:w="3312"/>
+            <w:tcW w:type="dxa" w:w="3600"/>
           </w:tcPr>
           <w:p>
             <w:r/>
@@ -2873,7 +2873,7 @@
                 <w:b w:val="0"/>
                 <w:sz w:val="19"/>
               </w:rPr>
-              <w:t>P / R / S indicator (optional)</w:t>
+              <w:t>Process owner</w:t>
             </w:r>
           </w:p>
         </w:tc>
@@ -2891,7 +2891,7 @@
                 <w:b w:val="0"/>
                 <w:sz w:val="19"/>
               </w:rPr>
-              <w:t>CREATED_BY</w:t>
+              <w:t>CREATED_ON</w:t>
             </w:r>
           </w:p>
         </w:tc>
@@ -2913,71 +2913,8 @@
         </w:tc>
         <w:tc>
           <w:tcPr>
-            <w:tcW w:type="dxa" w:w="3168"/>
+            <w:tcW w:type="dxa" w:w="2880"/>
             <w:shd w:val="clear" w:fill="F2F5FA"/>
-          </w:tcPr>
-          <w:p>
-            <w:r/>
-            <w:r>
-              <w:rPr>
-                <w:b w:val="0"/>
-                <w:sz w:val="19"/>
-              </w:rPr>
-              <w:t>UNAME (CHAR 12)</w:t>
-            </w:r>
-          </w:p>
-        </w:tc>
-        <w:tc>
-          <w:tcPr>
-            <w:tcW w:type="dxa" w:w="3312"/>
-            <w:shd w:val="clear" w:fill="F2F5FA"/>
-          </w:tcPr>
-          <w:p>
-            <w:r/>
-            <w:r>
-              <w:rPr>
-                <w:b w:val="0"/>
-                <w:sz w:val="19"/>
-              </w:rPr>
-              <w:t>Process owner</w:t>
-            </w:r>
-          </w:p>
-        </w:tc>
-      </w:tr>
-      <w:tr>
-        <w:tc>
-          <w:tcPr>
-            <w:tcW w:type="dxa" w:w="2016"/>
-          </w:tcPr>
-          <w:p>
-            <w:r/>
-            <w:r>
-              <w:rPr>
-                <w:b w:val="0"/>
-                <w:sz w:val="19"/>
-              </w:rPr>
-              <w:t>CREATED_ON</w:t>
-            </w:r>
-          </w:p>
-        </w:tc>
-        <w:tc>
-          <w:tcPr>
-            <w:tcW w:type="dxa" w:w="864"/>
-          </w:tcPr>
-          <w:p>
-            <w:r/>
-            <w:r>
-              <w:rPr>
-                <w:b w:val="0"/>
-                <w:sz w:val="19"/>
-              </w:rPr>
-              <w:t>No</w:t>
-            </w:r>
-          </w:p>
-        </w:tc>
-        <w:tc>
-          <w:tcPr>
-            <w:tcW w:type="dxa" w:w="3168"/>
           </w:tcPr>
           <w:p>
             <w:r/>
@@ -2992,7 +2929,8 @@
         </w:tc>
         <w:tc>
           <w:tcPr>
-            <w:tcW w:type="dxa" w:w="3312"/>
+            <w:tcW w:type="dxa" w:w="3600"/>
+            <w:shd w:val="clear" w:fill="F2F5FA"/>
           </w:tcPr>
           <w:p>
             <w:r/>
@@ -3013,7 +2951,7 @@
           <w:i/>
           <w:sz w:val="19"/>
         </w:rPr>
-        <w:t>Maintained by the process owner via a dedicated SM30 transaction with an authorisation group so that only authorised users can update it.</w:t>
+        <w:t>Note: the shortfall item is keyed on Material Number (MATNR) to match the signed material recorded in YRVA_QAIS_TNTLFT. Maintained by the process owner via a dedicated SM30 transaction with an authorisation group so that only authorised users can update it.</w:t>
       </w:r>
     </w:p>
     <w:p>

</xml_diff>